<commit_message>
2.6: adlandirma tablolari, numarali zincirler ve aromatik bilesik gorselleri baski boyutunda yeniden cizildi
</commit_message>
<xml_diff>
--- a/Kim12-2-6-Alifatik-Hidrokarbonlarin-Adlandirilmasi.docx
+++ b/Kim12-2-6-Alifatik-Hidrokarbonlarin-Adlandirilmasi.docx
@@ -3542,7 +3542,7 @@
       <w:r>
         <w:drawing>
           <wp:inline distT="0" distB="0" distL="0" distR="0">
-            <wp:extent cx="5400000" cy="5274855"/>
+            <wp:extent cx="5413258" cy="4764033"/>
             <wp:docPr id="900001" name="Grafik 900001" descr="Bazı dallanmış alkanların yarı açık formülleri ve sistematik adları"/>
             <wp:cNvGraphicFramePr>
               <a:graphicFrameLocks noChangeAspect="1"/>
@@ -3563,7 +3563,7 @@
                   <pic:spPr>
                     <a:xfrm>
                       <a:off x="0" y="0"/>
-                      <a:ext cx="5400000" cy="5274855"/>
+                      <a:ext cx="5413258" cy="4764033"/>
                     </a:xfrm>
                     <a:prstGeom prst="rect">
                       <a:avLst/>
@@ -3951,7 +3951,7 @@
       <w:r>
         <w:drawing>
           <wp:inline distT="0" distB="0" distL="0" distR="0">
-            <wp:extent cx="5400000" cy="3964784"/>
+            <wp:extent cx="5629667" cy="3035814"/>
             <wp:docPr id="900002" name="Grafik 900002" descr="Bazı alken ve alkinlerin yarı açık formülleri ve sistematik adları"/>
             <wp:cNvGraphicFramePr>
               <a:graphicFrameLocks noChangeAspect="1"/>
@@ -3972,7 +3972,7 @@
                   <pic:spPr>
                     <a:xfrm>
                       <a:off x="0" y="0"/>
-                      <a:ext cx="5400000" cy="3964784"/>
+                      <a:ext cx="5629667" cy="3035814"/>
                     </a:xfrm>
                     <a:prstGeom prst="rect">
                       <a:avLst/>
@@ -4012,7 +4012,7 @@
       <w:r>
         <w:drawing>
           <wp:inline distT="0" distB="0" distL="0" distR="0">
-            <wp:extent cx="5040000" cy="3198139"/>
+            <wp:extent cx="5413258" cy="2819405"/>
             <wp:docPr id="900003" name="Grafik 900003" descr="Bazı halkalı alifatik hidrokarbonların çizgi-bağ formülleri ve sistematik adları"/>
             <wp:cNvGraphicFramePr>
               <a:graphicFrameLocks noChangeAspect="1"/>
@@ -4033,7 +4033,7 @@
                   <pic:spPr>
                     <a:xfrm>
                       <a:off x="0" y="0"/>
-                      <a:ext cx="5040000" cy="3198139"/>
+                      <a:ext cx="5413258" cy="2819405"/>
                     </a:xfrm>
                     <a:prstGeom prst="rect">
                       <a:avLst/>
@@ -7851,7 +7851,7 @@
       <w:r>
         <w:drawing>
           <wp:inline distT="0" distB="0" distL="0" distR="0">
-            <wp:extent cx="5040000" cy="3874163"/>
+            <wp:extent cx="5053594" cy="2983997"/>
             <wp:docPr id="900007" name="Grafik 900007" descr="Görsel D: Bazı aromatik bileşiklerin özel adları ile fenil ve benzil grupları"/>
             <wp:cNvGraphicFramePr>
               <a:graphicFrameLocks noChangeAspect="1"/>
@@ -7872,7 +7872,7 @@
                   <pic:spPr>
                     <a:xfrm>
                       <a:off x="0" y="0"/>
-                      <a:ext cx="5040000" cy="3874163"/>
+                      <a:ext cx="5053594" cy="2983997"/>
                     </a:xfrm>
                     <a:prstGeom prst="rect">
                       <a:avLst/>
@@ -7959,7 +7959,7 @@
       <w:r>
         <w:drawing>
           <wp:inline distT="0" distB="0" distL="0" distR="0">
-            <wp:extent cx="2880000" cy="1509677"/>
+            <wp:extent cx="2877317" cy="1581915"/>
             <wp:docPr id="900008" name="Grafik 900008" descr="Adlandırılacak alkan"/>
             <wp:cNvGraphicFramePr>
               <a:graphicFrameLocks noChangeAspect="1"/>
@@ -7980,7 +7980,7 @@
                   <pic:spPr>
                     <a:xfrm>
                       <a:off x="0" y="0"/>
-                      <a:ext cx="2880000" cy="1509677"/>
+                      <a:ext cx="2877317" cy="1581915"/>
                     </a:xfrm>
                     <a:prstGeom prst="rect">
                       <a:avLst/>
@@ -8038,7 +8038,7 @@
       <w:r>
         <w:drawing>
           <wp:inline distT="0" distB="0" distL="0" distR="0">
-            <wp:extent cx="2880000" cy="1509677"/>
+            <wp:extent cx="2877317" cy="1581915"/>
             <wp:docPr id="900009" name="Grafik 900009" descr="Numaralandırılmış ana zincir"/>
             <wp:cNvGraphicFramePr>
               <a:graphicFrameLocks noChangeAspect="1"/>
@@ -8059,7 +8059,7 @@
                   <pic:spPr>
                     <a:xfrm>
                       <a:off x="0" y="0"/>
-                      <a:ext cx="2880000" cy="1509677"/>
+                      <a:ext cx="2877317" cy="1581915"/>
                     </a:xfrm>
                     <a:prstGeom prst="rect">
                       <a:avLst/>
@@ -8239,7 +8239,7 @@
       <w:r>
         <w:drawing>
           <wp:inline distT="0" distB="0" distL="0" distR="0">
-            <wp:extent cx="5400000" cy="1003888"/>
+            <wp:extent cx="5541275" cy="935737"/>
             <wp:docPr id="900011" name="Grafik 900011" descr="I ve II numaralı bileşikler"/>
             <wp:cNvGraphicFramePr>
               <a:graphicFrameLocks noChangeAspect="1"/>
@@ -8260,7 +8260,7 @@
                   <pic:spPr>
                     <a:xfrm>
                       <a:off x="0" y="0"/>
-                      <a:ext cx="5400000" cy="1003888"/>
+                      <a:ext cx="5541275" cy="935737"/>
                     </a:xfrm>
                     <a:prstGeom prst="rect">
                       <a:avLst/>
@@ -8334,7 +8334,7 @@
       <w:r>
         <w:drawing>
           <wp:inline distT="0" distB="0" distL="0" distR="0">
-            <wp:extent cx="5400000" cy="1102308"/>
+            <wp:extent cx="5541275" cy="1005842"/>
             <wp:docPr id="900012" name="Grafik 900012" descr="Numaralandırılmış yapılar"/>
             <wp:cNvGraphicFramePr>
               <a:graphicFrameLocks noChangeAspect="1"/>
@@ -8355,7 +8355,7 @@
                   <pic:spPr>
                     <a:xfrm>
                       <a:off x="0" y="0"/>
-                      <a:ext cx="5400000" cy="1102308"/>
+                      <a:ext cx="5541275" cy="1005842"/>
                     </a:xfrm>
                     <a:prstGeom prst="rect">
                       <a:avLst/>
@@ -8585,7 +8585,7 @@
       <w:r>
         <w:drawing>
           <wp:inline distT="0" distB="0" distL="0" distR="0">
-            <wp:extent cx="2880000" cy="1509677"/>
+            <wp:extent cx="3419862" cy="1798323"/>
             <wp:docPr id="900014" name="Grafik 900014" descr="3-etil-2,2-dimetilpentan"/>
             <wp:cNvGraphicFramePr>
               <a:graphicFrameLocks noChangeAspect="1"/>
@@ -8606,7 +8606,7 @@
                   <pic:spPr>
                     <a:xfrm>
                       <a:off x="0" y="0"/>
-                      <a:ext cx="2880000" cy="1509677"/>
+                      <a:ext cx="3419862" cy="1798323"/>
                     </a:xfrm>
                     <a:prstGeom prst="rect">
                       <a:avLst/>
@@ -8969,7 +8969,7 @@
       <w:r>
         <w:drawing>
           <wp:inline distT="0" distB="0" distL="0" distR="0">
-            <wp:extent cx="5400000" cy="4774275"/>
+            <wp:extent cx="5413258" cy="4764033"/>
             <wp:docPr id="900017" name="Grafik 900017" descr="Adlandırılacak hidrokarbonlar"/>
             <wp:cNvGraphicFramePr>
               <a:graphicFrameLocks noChangeAspect="1"/>
@@ -8990,7 +8990,7 @@
                   <pic:spPr>
                     <a:xfrm>
                       <a:off x="0" y="0"/>
-                      <a:ext cx="5400000" cy="4774275"/>
+                      <a:ext cx="5413258" cy="4764033"/>
                     </a:xfrm>
                     <a:prstGeom prst="rect">
                       <a:avLst/>
@@ -9672,7 +9672,7 @@
       <w:r>
         <w:drawing>
           <wp:inline distT="0" distB="0" distL="0" distR="0">
-            <wp:extent cx="4680000" cy="1126975"/>
+            <wp:extent cx="4678689" cy="1078994"/>
             <wp:docPr id="900018" name="Grafik 900018" descr="Bazı aromatik bileşikler"/>
             <wp:cNvGraphicFramePr>
               <a:graphicFrameLocks noChangeAspect="1"/>
@@ -9693,7 +9693,7 @@
                   <pic:spPr>
                     <a:xfrm>
                       <a:off x="0" y="0"/>
-                      <a:ext cx="4680000" cy="1126975"/>
+                      <a:ext cx="4678689" cy="1078994"/>
                     </a:xfrm>
                     <a:prstGeom prst="rect">
                       <a:avLst/>

</xml_diff>

<commit_message>
Kim12-2-6-Alifatik-Hidrokarbonlarin-Adlandirilmasi: gorsel alanlarina Shutter onizlemeleri yerlestirildi (2.3 bicimi)
</commit_message>
<xml_diff>
--- a/Kim12-2-6-Alifatik-Hidrokarbonlarin-Adlandirilmasi.docx
+++ b/Kim12-2-6-Alifatik-Hidrokarbonlarin-Adlandirilmasi.docx
@@ -69,99 +69,73 @@
         <w:t xml:space="preserve">’dur; ancak aynı formüle sahip, yapısı farklı başka bir bileşik daha vardır. Bilinen organik bileşiklerin sayısı milyonlarla ifade edilir. Peki bu bileşiklerin her birine, adından yapısı tek anlamlı olarak çizilebilecek biçimde nasıl ad verilebilir? “2,2,4-trimetilpentan” adındaki sayılar ve ekler molekülün yapısı hakkında hangi bilgileri verir? Bu soruların cevabını bir etkinlik yaparak keşfediniz. Analiz ve Keşif Atölyesi 2.6.’da tümevarımsal akıl yürüteceksiniz: Yarı açık formülleri ve sistematik adları verilen alifatik hidrokarbon örneklerini inceleyerek adlandırmadaki örüntüleri bulacak, her hidrokarbon sınıfı için genel bir formül belirleyecek ve IUPAC adlandırma kurallarına ilişkin genellemeler yapacaksınız. Örnekleri sistemli biçimde karşılaştırmanız analitik düşünmenizi, tablolardaki verileri düzenleyip yorumlamanız veri okuryazarlığınızı geliştirecek; kurallarınızı güvenilir bilgilerle sınamanız araştırmacı ve sorgulayıcı tutumunuzu güçlendirecektir. Çalışmanızı kendiniz de değerlendirerek öğrenme sürecinizi yöneteceksiniz.</w:t>
       </w:r>
     </w:p>
-    <w:tbl>
-      <w:tblPr>
-        <w:tblW w:w="9000" w:type="dxa"/>
+    <w:p>
+      <w:pPr>
         <w:jc w:val="center"/>
-        <w:tblBorders>
-          <w:top w:val="single" w:sz="8" w:space="0" w:color="7F7F7F"/>
-          <w:left w:val="single" w:sz="8" w:space="0" w:color="7F7F7F"/>
-          <w:bottom w:val="single" w:sz="8" w:space="0" w:color="7F7F7F"/>
-          <w:right w:val="single" w:sz="8" w:space="0" w:color="7F7F7F"/>
-        </w:tblBorders>
-      </w:tblPr>
-      <w:tblGrid>
-        <w:gridCol w:w="9000"/>
-      </w:tblGrid>
-      <w:tr>
-        <w:tc>
-          <w:tcPr>
-            <w:tcW w:w="9000" w:type="dxa"/>
-            <w:shd w:val="clear" w:color="auto" w:fill="EDEDED"/>
-          </w:tcPr>
-          <w:p>
-            <w:pPr>
-              <w:jc w:val="both"/>
-              <w:rPr>
-                <w:rFonts w:ascii="Times New Roman" w:hAnsi="Times New Roman" w:cs="Times New Roman"/>
-                <w:lang w:val="tr-TR"/>
-              </w:rPr>
-            </w:pPr>
-            <w:r>
-              <w:rPr>
-                <w:rFonts w:ascii="Times New Roman" w:hAnsi="Times New Roman" w:cs="Times New Roman"/>
-                <w:lang w:val="tr-TR"/>
-              </w:rPr>
-              <w:t xml:space="preserve">GÖRSEL ALANI (Shutterstock)</w:t>
-            </w:r>
-          </w:p>
-          <w:p>
-            <w:pPr>
-              <w:jc w:val="both"/>
-              <w:rPr>
-                <w:rFonts w:ascii="Times New Roman" w:hAnsi="Times New Roman" w:cs="Times New Roman"/>
-                <w:lang w:val="tr-TR"/>
-              </w:rPr>
-            </w:pPr>
-            <w:r>
-              <w:rPr>
-                <w:rFonts w:ascii="Times New Roman" w:hAnsi="Times New Roman" w:cs="Times New Roman"/>
-                <w:lang w:val="tr-TR"/>
-              </w:rPr>
-              <w:t xml:space="preserve">Tarif: Akaryakıt istasyonunda oktan sayısı (95, 97 gibi) yazılı benzin pompası tabancaları; yakın çekim (marka/logo görünmesin).</w:t>
-            </w:r>
-          </w:p>
-          <w:p>
-            <w:pPr>
-              <w:jc w:val="both"/>
-              <w:rPr>
-                <w:rFonts w:ascii="Times New Roman" w:hAnsi="Times New Roman" w:cs="Times New Roman"/>
-                <w:lang w:val="tr-TR"/>
-              </w:rPr>
-            </w:pPr>
-            <w:r>
-              <w:rPr>
-                <w:rFonts w:ascii="Times New Roman" w:hAnsi="Times New Roman" w:cs="Times New Roman"/>
-                <w:lang w:val="tr-TR"/>
-              </w:rPr>
-              <w:t xml:space="preserve">Shutter ID: 718639114 (fotoğraf) — Fuel nozzle dispensing pump with octane numbers</w:t>
-            </w:r>
-          </w:p>
-        </w:tc>
-      </w:tr>
-    </w:tbl>
+      </w:pPr>
+      <w:r>
+        <w:drawing>
+          <wp:inline xmlns:a="http://schemas.openxmlformats.org/drawingml/2006/main" xmlns:pic="http://schemas.openxmlformats.org/drawingml/2006/picture">
+            <wp:extent cx="3448905" cy="2520000"/>
+            <wp:docPr id="900021" name="Picture 900021"/>
+            <wp:cNvGraphicFramePr>
+              <a:graphicFrameLocks noChangeAspect="1"/>
+            </wp:cNvGraphicFramePr>
+            <a:graphic>
+              <a:graphicData uri="http://schemas.openxmlformats.org/drawingml/2006/picture">
+                <pic:pic>
+                  <pic:nvPicPr>
+                    <pic:cNvPr id="0" name="718639114_d.jpg"/>
+                    <pic:cNvPicPr/>
+                  </pic:nvPicPr>
+                  <pic:blipFill>
+                    <a:blip r:embed="rId11"/>
+                    <a:stretch>
+                      <a:fillRect/>
+                    </a:stretch>
+                  </pic:blipFill>
+                  <pic:spPr>
+                    <a:xfrm>
+                      <a:off x="0" y="0"/>
+                      <a:ext cx="3448905" cy="2520000"/>
+                    </a:xfrm>
+                    <a:prstGeom prst="rect"/>
+                  </pic:spPr>
+                </pic:pic>
+              </a:graphicData>
+            </a:graphic>
+          </wp:inline>
+        </w:drawing>
+      </w:r>
+    </w:p>
     <w:p>
       <w:pPr>
-        <w:jc w:val="both"/>
-        <w:rPr>
-          <w:rFonts w:ascii="Times New Roman" w:hAnsi="Times New Roman" w:cs="Times New Roman"/>
-          <w:lang w:val="tr-TR"/>
-        </w:rPr>
-      </w:pPr>
-    </w:p>
-    <w:p>
-      <w:pPr>
         <w:jc w:val="center"/>
-        <w:rPr>
-          <w:rFonts w:ascii="Times New Roman" w:hAnsi="Times New Roman" w:cs="Times New Roman"/>
-          <w:lang w:val="tr-TR"/>
-        </w:rPr>
       </w:pPr>
       <w:r>
         <w:rPr>
           <w:rFonts w:ascii="Times New Roman" w:hAnsi="Times New Roman" w:cs="Times New Roman"/>
           <w:b/>
           <w:bCs/>
+          <w:highlight w:val="yellow"/>
+          <w:lang w:val="tr-TR"/>
+        </w:rPr>
+        <w:t xml:space="preserve">Shutter id: 718639114</w:t>
+      </w:r>
+    </w:p>
+    <w:p>
+      <w:pPr>
+        <w:jc w:val="center"/>
+        <w:rPr>
+          <w:rFonts w:ascii="Times New Roman" w:hAnsi="Times New Roman" w:cs="Times New Roman"/>
+          <w:lang w:val="tr-TR"/>
+        </w:rPr>
+      </w:pPr>
+      <w:r>
+        <w:rPr>
+          <w:rFonts w:ascii="Times New Roman" w:hAnsi="Times New Roman" w:cs="Times New Roman"/>
+          <w:b/>
+          <w:bCs/>
           <w:lang w:val="tr-TR"/>
         </w:rPr>
         <w:t xml:space="preserve">Görsel A:</w:t>
@@ -174,85 +148,59 @@
         <w:t xml:space="preserve"> Akaryakıt pompası</w:t>
       </w:r>
     </w:p>
-    <w:tbl>
-      <w:tblPr>
-        <w:tblW w:w="9000" w:type="dxa"/>
+    <w:p>
+      <w:pPr>
         <w:jc w:val="center"/>
-        <w:tblBorders>
-          <w:top w:val="single" w:sz="8" w:space="0" w:color="7F7F7F"/>
-          <w:left w:val="single" w:sz="8" w:space="0" w:color="7F7F7F"/>
-          <w:bottom w:val="single" w:sz="8" w:space="0" w:color="7F7F7F"/>
-          <w:right w:val="single" w:sz="8" w:space="0" w:color="7F7F7F"/>
-        </w:tblBorders>
-      </w:tblPr>
-      <w:tblGrid>
-        <w:gridCol w:w="9000"/>
-      </w:tblGrid>
-      <w:tr>
-        <w:tc>
-          <w:tcPr>
-            <w:tcW w:w="9000" w:type="dxa"/>
-            <w:shd w:val="clear" w:color="auto" w:fill="EDEDED"/>
-          </w:tcPr>
-          <w:p>
-            <w:pPr>
-              <w:jc w:val="both"/>
-              <w:rPr>
-                <w:rFonts w:ascii="Times New Roman" w:hAnsi="Times New Roman" w:cs="Times New Roman"/>
-                <w:lang w:val="tr-TR"/>
-              </w:rPr>
-            </w:pPr>
-            <w:r>
-              <w:rPr>
-                <w:rFonts w:ascii="Times New Roman" w:hAnsi="Times New Roman" w:cs="Times New Roman"/>
-                <w:lang w:val="tr-TR"/>
-              </w:rPr>
-              <w:t xml:space="preserve">GÖRSEL ALANI (Shutterstock)</w:t>
-            </w:r>
-          </w:p>
-          <w:p>
-            <w:pPr>
-              <w:jc w:val="both"/>
-              <w:rPr>
-                <w:rFonts w:ascii="Times New Roman" w:hAnsi="Times New Roman" w:cs="Times New Roman"/>
-                <w:lang w:val="tr-TR"/>
-              </w:rPr>
-            </w:pPr>
-            <w:r>
-              <w:rPr>
-                <w:rFonts w:ascii="Times New Roman" w:hAnsi="Times New Roman" w:cs="Times New Roman"/>
-                <w:lang w:val="tr-TR"/>
-              </w:rPr>
-              <w:t xml:space="preserve">Tarif: Doğada bir kamp ocağı ve ocağa takılı bütan gaz kartuşu; ocakta mavi alev (marka/logo görünmesin).</w:t>
-            </w:r>
-          </w:p>
-          <w:p>
-            <w:pPr>
-              <w:jc w:val="both"/>
-              <w:rPr>
-                <w:rFonts w:ascii="Times New Roman" w:hAnsi="Times New Roman" w:cs="Times New Roman"/>
-                <w:lang w:val="tr-TR"/>
-              </w:rPr>
-            </w:pPr>
-            <w:r>
-              <w:rPr>
-                <w:rFonts w:ascii="Times New Roman" w:hAnsi="Times New Roman" w:cs="Times New Roman"/>
-                <w:lang w:val="tr-TR"/>
-              </w:rPr>
-              <w:t xml:space="preserve">Shutter ID: 2479684129 (fotoğraf) — Portable gas burner on a disposable butane cartridge</w:t>
-            </w:r>
-          </w:p>
-        </w:tc>
-      </w:tr>
-    </w:tbl>
+      </w:pPr>
+      <w:r>
+        <w:drawing>
+          <wp:inline xmlns:a="http://schemas.openxmlformats.org/drawingml/2006/main" xmlns:pic="http://schemas.openxmlformats.org/drawingml/2006/picture">
+            <wp:extent cx="3436363" cy="2520000"/>
+            <wp:docPr id="900022" name="Picture 900022"/>
+            <wp:cNvGraphicFramePr>
+              <a:graphicFrameLocks noChangeAspect="1"/>
+            </wp:cNvGraphicFramePr>
+            <a:graphic>
+              <a:graphicData uri="http://schemas.openxmlformats.org/drawingml/2006/picture">
+                <pic:pic>
+                  <pic:nvPicPr>
+                    <pic:cNvPr id="0" name="2479684129_d.jpg"/>
+                    <pic:cNvPicPr/>
+                  </pic:nvPicPr>
+                  <pic:blipFill>
+                    <a:blip r:embed="rId12"/>
+                    <a:stretch>
+                      <a:fillRect/>
+                    </a:stretch>
+                  </pic:blipFill>
+                  <pic:spPr>
+                    <a:xfrm>
+                      <a:off x="0" y="0"/>
+                      <a:ext cx="3436363" cy="2520000"/>
+                    </a:xfrm>
+                    <a:prstGeom prst="rect"/>
+                  </pic:spPr>
+                </pic:pic>
+              </a:graphicData>
+            </a:graphic>
+          </wp:inline>
+        </w:drawing>
+      </w:r>
+    </w:p>
     <w:p>
       <w:pPr>
-        <w:jc w:val="both"/>
-        <w:rPr>
-          <w:rFonts w:ascii="Times New Roman" w:hAnsi="Times New Roman" w:cs="Times New Roman"/>
-          <w:lang w:val="tr-TR"/>
-        </w:rPr>
-      </w:pPr>
+        <w:jc w:val="center"/>
+      </w:pPr>
+      <w:r>
+        <w:rPr>
+          <w:rFonts w:ascii="Times New Roman" w:hAnsi="Times New Roman" w:cs="Times New Roman"/>
+          <w:b/>
+          <w:bCs/>
+          <w:highlight w:val="yellow"/>
+          <w:lang w:val="tr-TR"/>
+        </w:rPr>
+        <w:t xml:space="preserve">Shutter id: 2479684129</w:t>
+      </w:r>
     </w:p>
     <w:p>
       <w:pPr>

</xml_diff>